<commit_message>
docs: update official live Vercel and Render deployment links
</commit_message>
<xml_diff>
--- a/QE190087_PRN232_Ass2.docx
+++ b/QE190087_PRN232_Ass2.docx
@@ -2926,20 +2926,20 @@
         <w:spacing w:after="80"/>
       </w:pPr>
       <w:r>
-        <w:t>• Live Render Backend URL (Swagger API v2): https://prn232-ass1.onrender.com</w:t>
-      </w:r>
-    </w:p>
-    <w:p>
-      <w:pPr>
-        <w:pStyle w:val="ListParagraph"/>
-        <w:numPr>
-          <w:ilvl w:val="0"/>
-          <w:numId w:val="2"/>
-        </w:numPr>
-        <w:spacing w:after="80"/>
-      </w:pPr>
-      <w:r>
-        <w:t>• Live Vercel Frontend URL: https://prn232-ass1-ass2.vercel.app (hoặc https://prn232-ass1.vercel.app)</w:t>
+        <w:t>• Live Render Backend URL (Swagger API v2): https://prn232-ass2.onrender.com (hoặc https://prn232-ass1.onrender.com)</w:t>
+      </w:r>
+    </w:p>
+    <w:p>
+      <w:pPr>
+        <w:pStyle w:val="ListParagraph"/>
+        <w:numPr>
+          <w:ilvl w:val="0"/>
+          <w:numId w:val="2"/>
+        </w:numPr>
+        <w:spacing w:after="80"/>
+      </w:pPr>
+      <w:r>
+        <w:t>• Live Vercel Frontend URL: https://prn232-ass2-fe.vercel.app</w:t>
       </w:r>
     </w:p>
     <w:p>

</xml_diff>

<commit_message>
docs: finalize official backend Render URL
</commit_message>
<xml_diff>
--- a/QE190087_PRN232_Ass2.docx
+++ b/QE190087_PRN232_Ass2.docx
@@ -2913,20 +2913,20 @@
         <w:spacing w:after="80"/>
       </w:pPr>
       <w:r>
-        <w:t>• Public GitHub Repository (Backend &amp; Frontend Monorepo): https://github.com/Phamtin147/prn232-ass1-ass2</w:t>
-      </w:r>
-    </w:p>
-    <w:p>
-      <w:pPr>
-        <w:pStyle w:val="ListParagraph"/>
-        <w:numPr>
-          <w:ilvl w:val="0"/>
-          <w:numId w:val="2"/>
-        </w:numPr>
-        <w:spacing w:after="80"/>
-      </w:pPr>
-      <w:r>
-        <w:t>• Live Render Backend URL (Swagger API v2): https://prn232-ass2.onrender.com (hoặc https://prn232-ass1.onrender.com)</w:t>
+        <w:t>• Public GitHub Repository: https://github.com/Phamtin147/prn232-ass1-ass2</w:t>
+      </w:r>
+    </w:p>
+    <w:p>
+      <w:pPr>
+        <w:pStyle w:val="ListParagraph"/>
+        <w:numPr>
+          <w:ilvl w:val="0"/>
+          <w:numId w:val="2"/>
+        </w:numPr>
+        <w:spacing w:after="80"/>
+      </w:pPr>
+      <w:r>
+        <w:t>• Live Render Backend URL (Swagger API v2): https://prn232-ass1.onrender.com</w:t>
       </w:r>
     </w:p>
     <w:p>

</xml_diff>

<commit_message>
docs: match exact submission report layout and structure from Ass1
</commit_message>
<xml_diff>
--- a/QE190087_PRN232_Ass2.docx
+++ b/QE190087_PRN232_Ass2.docx
@@ -11,9 +11,9 @@
           <w:rFonts w:ascii="Arial" w:hAnsi="Arial"/>
           <w:b/>
           <w:color w:val="1E3A8A"/>
-          <w:sz w:val="36"/>
+          <w:sz w:val="32"/>
         </w:rPr>
-        <w:t>PRN232 – PRACTICAL ASSIGNMENT 2 SUBMISSION</w:t>
+        <w:t>PRN232 — ASSIGNMENT 2 SUBMISSION REPORT</w:t>
       </w:r>
     </w:p>
     <w:p>
@@ -31,142 +31,6 @@
       </w:r>
     </w:p>
     <w:p/>
-    <w:tbl>
-      <w:tblPr>
-        <w:tblW w:type="auto" w:w="0"/>
-        <w:jc w:val="center"/>
-        <w:tblLook w:firstColumn="1" w:firstRow="1" w:lastColumn="0" w:lastRow="0" w:noHBand="0" w:noVBand="1" w:val="04A0"/>
-      </w:tblPr>
-      <w:tblGrid>
-        <w:gridCol w:w="4680"/>
-        <w:gridCol w:w="4680"/>
-      </w:tblGrid>
-      <w:tr>
-        <w:tc>
-          <w:tcPr>
-            <w:tcW w:type="dxa" w:w="4680"/>
-          </w:tcPr>
-          <w:p>
-            <w:r>
-              <w:rPr>
-                <w:rFonts w:ascii="Arial" w:hAnsi="Arial"/>
-                <w:b/>
-                <w:sz w:val="21"/>
-              </w:rPr>
-              <w:t>Student ID:</w:t>
-            </w:r>
-          </w:p>
-        </w:tc>
-        <w:tc>
-          <w:tcPr>
-            <w:tcW w:type="dxa" w:w="4680"/>
-          </w:tcPr>
-          <w:p>
-            <w:r>
-              <w:rPr>
-                <w:rFonts w:ascii="Arial" w:hAnsi="Arial"/>
-                <w:sz w:val="21"/>
-              </w:rPr>
-              <w:t>QE190087</w:t>
-            </w:r>
-          </w:p>
-        </w:tc>
-      </w:tr>
-      <w:tr>
-        <w:tc>
-          <w:tcPr>
-            <w:tcW w:type="dxa" w:w="4680"/>
-          </w:tcPr>
-          <w:p>
-            <w:r>
-              <w:rPr>
-                <w:rFonts w:ascii="Arial" w:hAnsi="Arial"/>
-                <w:b/>
-                <w:sz w:val="21"/>
-              </w:rPr>
-              <w:t>Subject / Class:</w:t>
-            </w:r>
-          </w:p>
-        </w:tc>
-        <w:tc>
-          <w:tcPr>
-            <w:tcW w:type="dxa" w:w="4680"/>
-          </w:tcPr>
-          <w:p>
-            <w:r>
-              <w:rPr>
-                <w:rFonts w:ascii="Arial" w:hAnsi="Arial"/>
-                <w:sz w:val="21"/>
-              </w:rPr>
-              <w:t>PRN232</w:t>
-            </w:r>
-          </w:p>
-        </w:tc>
-      </w:tr>
-      <w:tr>
-        <w:tc>
-          <w:tcPr>
-            <w:tcW w:type="dxa" w:w="4680"/>
-          </w:tcPr>
-          <w:p>
-            <w:r>
-              <w:rPr>
-                <w:rFonts w:ascii="Arial" w:hAnsi="Arial"/>
-                <w:b/>
-                <w:sz w:val="21"/>
-              </w:rPr>
-              <w:t>Tech Stack:</w:t>
-            </w:r>
-          </w:p>
-        </w:tc>
-        <w:tc>
-          <w:tcPr>
-            <w:tcW w:type="dxa" w:w="4680"/>
-          </w:tcPr>
-          <w:p>
-            <w:r>
-              <w:rPr>
-                <w:rFonts w:ascii="Arial" w:hAnsi="Arial"/>
-                <w:sz w:val="21"/>
-              </w:rPr>
-              <w:t>ASP.NET Core Web API (.NET 8) | PostgreSQL | Next.js 16 (App Router)</w:t>
-            </w:r>
-          </w:p>
-        </w:tc>
-      </w:tr>
-      <w:tr>
-        <w:tc>
-          <w:tcPr>
-            <w:tcW w:type="dxa" w:w="4680"/>
-          </w:tcPr>
-          <w:p>
-            <w:r>
-              <w:rPr>
-                <w:rFonts w:ascii="Arial" w:hAnsi="Arial"/>
-                <w:b/>
-                <w:sz w:val="21"/>
-              </w:rPr>
-              <w:t>Deployment Platform:</w:t>
-            </w:r>
-          </w:p>
-        </w:tc>
-        <w:tc>
-          <w:tcPr>
-            <w:tcW w:type="dxa" w:w="4680"/>
-          </w:tcPr>
-          <w:p>
-            <w:r>
-              <w:rPr>
-                <w:rFonts w:ascii="Arial" w:hAnsi="Arial"/>
-                <w:sz w:val="21"/>
-              </w:rPr>
-              <w:t>Render (Backend &amp; Database) | Vercel (Frontend)</w:t>
-            </w:r>
-          </w:p>
-        </w:tc>
-      </w:tr>
-    </w:tbl>
-    <w:p/>
     <w:p>
       <w:pPr>
         <w:pStyle w:val="Heading1"/>
@@ -176,7 +40,7 @@
           <w:rFonts w:ascii="Arial" w:hAnsi="Arial"/>
           <w:color w:val="1E3A8A"/>
         </w:rPr>
-        <w:t>1. Deliverable Links</w:t>
+        <w:t>1. Student &amp; Course Information</w:t>
       </w:r>
     </w:p>
     <w:tbl>
@@ -199,9 +63,8 @@
               <w:rPr>
                 <w:rFonts w:ascii="Arial" w:hAnsi="Arial"/>
                 <w:b/>
-                <w:sz w:val="20"/>
               </w:rPr>
-              <w:t>Public GitHub Repository</w:t>
+              <w:t>Student ID</w:t>
             </w:r>
           </w:p>
         </w:tc>
@@ -213,10 +76,8 @@
             <w:r>
               <w:rPr>
                 <w:rFonts w:ascii="Arial" w:hAnsi="Arial"/>
-                <w:color w:val="2563EB"/>
-                <w:sz w:val="20"/>
               </w:rPr>
-              <w:t>https://github.com/Phamtin147/prn232-ass1-ass2</w:t>
+              <w:t>QE190087</w:t>
             </w:r>
           </w:p>
         </w:tc>
@@ -231,9 +92,8 @@
               <w:rPr>
                 <w:rFonts w:ascii="Arial" w:hAnsi="Arial"/>
                 <w:b/>
-                <w:sz w:val="20"/>
               </w:rPr>
-              <w:t>Live Render Backend URL (Swagger UI)</w:t>
+              <w:t>Subject / Class Code</w:t>
             </w:r>
           </w:p>
         </w:tc>
@@ -245,10 +105,8 @@
             <w:r>
               <w:rPr>
                 <w:rFonts w:ascii="Arial" w:hAnsi="Arial"/>
-                <w:color w:val="2563EB"/>
-                <w:sz w:val="20"/>
               </w:rPr>
-              <w:t>https://prn232-ass2.onrender.com</w:t>
+              <w:t>PRN232</w:t>
             </w:r>
           </w:p>
         </w:tc>
@@ -263,9 +121,8 @@
               <w:rPr>
                 <w:rFonts w:ascii="Arial" w:hAnsi="Arial"/>
                 <w:b/>
-                <w:sz w:val="20"/>
               </w:rPr>
-              <w:t>Live Vercel Frontend URL</w:t>
+              <w:t>Assignment</w:t>
             </w:r>
           </w:p>
         </w:tc>
@@ -277,10 +134,8 @@
             <w:r>
               <w:rPr>
                 <w:rFonts w:ascii="Arial" w:hAnsi="Arial"/>
-                <w:color w:val="2563EB"/>
-                <w:sz w:val="20"/>
               </w:rPr>
-              <w:t>https://prn232-ass2-fe.vercel.app</w:t>
+              <w:t>Assignment 2 of 2 (Auth, RBAC &amp; Protected Management)</w:t>
             </w:r>
           </w:p>
         </w:tc>
@@ -295,9 +150,8 @@
               <w:rPr>
                 <w:rFonts w:ascii="Arial" w:hAnsi="Arial"/>
                 <w:b/>
-                <w:sz w:val="20"/>
               </w:rPr>
-              <w:t>PostgreSQL Database</w:t>
+              <w:t>Tech Stack</w:t>
             </w:r>
           </w:p>
         </w:tc>
@@ -309,42 +163,8 @@
             <w:r>
               <w:rPr>
                 <w:rFonts w:ascii="Arial" w:hAnsi="Arial"/>
-                <w:color w:val="2563EB"/>
-                <w:sz w:val="20"/>
               </w:rPr>
-              <w:t>Managed Cloud PostgreSQL on Render (Oregon)</w:t>
-            </w:r>
-          </w:p>
-        </w:tc>
-      </w:tr>
-      <w:tr>
-        <w:tc>
-          <w:tcPr>
-            <w:tcW w:type="dxa" w:w="4680"/>
-          </w:tcPr>
-          <w:p>
-            <w:r>
-              <w:rPr>
-                <w:rFonts w:ascii="Arial" w:hAnsi="Arial"/>
-                <w:b/>
-                <w:sz w:val="20"/>
-              </w:rPr>
-              <w:t>API Version &amp; Documentation</w:t>
-            </w:r>
-          </w:p>
-        </w:tc>
-        <w:tc>
-          <w:tcPr>
-            <w:tcW w:type="dxa" w:w="4680"/>
-          </w:tcPr>
-          <w:p>
-            <w:r>
-              <w:rPr>
-                <w:rFonts w:ascii="Arial" w:hAnsi="Arial"/>
-                <w:color w:val="2563EB"/>
-                <w:sz w:val="20"/>
-              </w:rPr>
-              <w:t>https://prn232-ass2.onrender.com/swagger (TaskTrack API v2)</w:t>
+              <w:t>ASP.NET Core Web API (.NET 8) | PostgreSQL | Next.js (TypeScript)</w:t>
             </w:r>
           </w:p>
         </w:tc>
@@ -360,16 +180,151 @@
           <w:rFonts w:ascii="Arial" w:hAnsi="Arial"/>
           <w:color w:val="1E3A8A"/>
         </w:rPr>
-        <w:t>2. Test Credentials for Grading Verification</w:t>
+        <w:t>2. Required Deliverable Links</w:t>
       </w:r>
     </w:p>
+    <w:tbl>
+      <w:tblPr>
+        <w:tblW w:type="auto" w:w="0"/>
+        <w:jc w:val="center"/>
+        <w:tblLook w:firstColumn="1" w:firstRow="1" w:lastColumn="0" w:lastRow="0" w:noHBand="0" w:noVBand="1" w:val="04A0"/>
+      </w:tblPr>
+      <w:tblGrid>
+        <w:gridCol w:w="4680"/>
+        <w:gridCol w:w="4680"/>
+      </w:tblGrid>
+      <w:tr>
+        <w:tc>
+          <w:tcPr>
+            <w:tcW w:type="dxa" w:w="4680"/>
+          </w:tcPr>
+          <w:p>
+            <w:r>
+              <w:rPr>
+                <w:rFonts w:ascii="Arial" w:hAnsi="Arial"/>
+                <w:b/>
+              </w:rPr>
+              <w:t>GitHub Repo (Backend)</w:t>
+            </w:r>
+          </w:p>
+        </w:tc>
+        <w:tc>
+          <w:tcPr>
+            <w:tcW w:type="dxa" w:w="4680"/>
+          </w:tcPr>
+          <w:p>
+            <w:r>
+              <w:rPr>
+                <w:rFonts w:ascii="Arial" w:hAnsi="Arial"/>
+                <w:color w:val="2563EB"/>
+              </w:rPr>
+              <w:t>https://github.com/Phamtin147/prn232-ass1-ass2/tree/main/backend</w:t>
+            </w:r>
+          </w:p>
+        </w:tc>
+      </w:tr>
+      <w:tr>
+        <w:tc>
+          <w:tcPr>
+            <w:tcW w:type="dxa" w:w="4680"/>
+          </w:tcPr>
+          <w:p>
+            <w:r>
+              <w:rPr>
+                <w:rFonts w:ascii="Arial" w:hAnsi="Arial"/>
+                <w:b/>
+              </w:rPr>
+              <w:t>GitHub Repo (Frontend)</w:t>
+            </w:r>
+          </w:p>
+        </w:tc>
+        <w:tc>
+          <w:tcPr>
+            <w:tcW w:type="dxa" w:w="4680"/>
+          </w:tcPr>
+          <w:p>
+            <w:r>
+              <w:rPr>
+                <w:rFonts w:ascii="Arial" w:hAnsi="Arial"/>
+                <w:color w:val="2563EB"/>
+              </w:rPr>
+              <w:t>https://github.com/Phamtin147/prn232-ass1-ass2/tree/main/frontend</w:t>
+            </w:r>
+          </w:p>
+        </w:tc>
+      </w:tr>
+      <w:tr>
+        <w:tc>
+          <w:tcPr>
+            <w:tcW w:type="dxa" w:w="4680"/>
+          </w:tcPr>
+          <w:p>
+            <w:r>
+              <w:rPr>
+                <w:rFonts w:ascii="Arial" w:hAnsi="Arial"/>
+                <w:b/>
+              </w:rPr>
+              <w:t>Live Backend (Render)</w:t>
+            </w:r>
+          </w:p>
+        </w:tc>
+        <w:tc>
+          <w:tcPr>
+            <w:tcW w:type="dxa" w:w="4680"/>
+          </w:tcPr>
+          <w:p>
+            <w:r>
+              <w:rPr>
+                <w:rFonts w:ascii="Arial" w:hAnsi="Arial"/>
+                <w:color w:val="2563EB"/>
+              </w:rPr>
+              <w:t>https://prn232-ass2.onrender.com (Swagger accessible at root /)</w:t>
+            </w:r>
+          </w:p>
+        </w:tc>
+      </w:tr>
+      <w:tr>
+        <w:tc>
+          <w:tcPr>
+            <w:tcW w:type="dxa" w:w="4680"/>
+          </w:tcPr>
+          <w:p>
+            <w:r>
+              <w:rPr>
+                <w:rFonts w:ascii="Arial" w:hAnsi="Arial"/>
+                <w:b/>
+              </w:rPr>
+              <w:t>Live Frontend (Vercel)</w:t>
+            </w:r>
+          </w:p>
+        </w:tc>
+        <w:tc>
+          <w:tcPr>
+            <w:tcW w:type="dxa" w:w="4680"/>
+          </w:tcPr>
+          <w:p>
+            <w:r>
+              <w:rPr>
+                <w:rFonts w:ascii="Arial" w:hAnsi="Arial"/>
+                <w:color w:val="2563EB"/>
+              </w:rPr>
+              <w:t>https://prn232-ass2-fe.vercel.app/</w:t>
+            </w:r>
+          </w:p>
+        </w:tc>
+      </w:tr>
+    </w:tbl>
+    <w:p/>
     <w:p>
+      <w:pPr>
+        <w:pStyle w:val="Heading1"/>
+      </w:pPr>
       <w:r>
         <w:rPr>
           <w:rFonts w:ascii="Arial" w:hAnsi="Arial"/>
-          <w:sz w:val="21"/>
+          <w:color w:val="1E3A8A"/>
         </w:rPr>
-        <w:t>Both test accounts are active and pre-seeded on the live database. Grader can immediately sign in at the Vercel URL or authenticate via Swagger Bearer token:</w:t>
+        <w:t>3. Test Credentials for Grading Verification</w:t>
       </w:r>
     </w:p>
     <w:tbl>
@@ -394,7 +349,6 @@
               <w:rPr>
                 <w:rFonts w:ascii="Arial" w:hAnsi="Arial"/>
                 <w:b/>
-                <w:sz w:val="20"/>
               </w:rPr>
               <w:t>Account Type</w:t>
             </w:r>
@@ -409,7 +363,6 @@
               <w:rPr>
                 <w:rFonts w:ascii="Arial" w:hAnsi="Arial"/>
                 <w:b/>
-                <w:sz w:val="20"/>
               </w:rPr>
               <w:t>Email Address</w:t>
             </w:r>
@@ -424,7 +377,6 @@
               <w:rPr>
                 <w:rFonts w:ascii="Arial" w:hAnsi="Arial"/>
                 <w:b/>
-                <w:sz w:val="20"/>
               </w:rPr>
               <w:t>Password</w:t>
             </w:r>
@@ -439,7 +391,6 @@
               <w:rPr>
                 <w:rFonts w:ascii="Arial" w:hAnsi="Arial"/>
                 <w:b/>
-                <w:sz w:val="20"/>
               </w:rPr>
               <w:t>Role &amp; Permissions</w:t>
             </w:r>
@@ -455,7 +406,6 @@
             <w:r>
               <w:rPr>
                 <w:rFonts w:ascii="Arial" w:hAnsi="Arial"/>
-                <w:sz w:val="20"/>
               </w:rPr>
               <w:t>Administrator</w:t>
             </w:r>
@@ -470,7 +420,6 @@
               <w:rPr>
                 <w:rFonts w:ascii="Arial" w:hAnsi="Arial"/>
                 <w:b/>
-                <w:sz w:val="20"/>
               </w:rPr>
               <w:t>admin@tasktrack.com</w:t>
             </w:r>
@@ -485,7 +434,6 @@
               <w:rPr>
                 <w:rFonts w:ascii="Arial" w:hAnsi="Arial"/>
                 <w:b/>
-                <w:sz w:val="20"/>
               </w:rPr>
               <w:t>Admin@123456</w:t>
             </w:r>
@@ -499,15 +447,12 @@
             <w:r>
               <w:rPr>
                 <w:rFonts w:ascii="Arial" w:hAnsi="Arial"/>
-                <w:sz w:val="20"/>
               </w:rPr>
               <w:t>Role = 1 (Admin)</w:t>
               <w:br/>
-              <w:t>• Full CRUD access to all resources</w:t>
+              <w:t>• Full access to all CRUD &amp; Account Management (/admin/accounts)</w:t>
               <w:br/>
-              <w:t>• Account Management (/admin/accounts)</w:t>
-              <w:br/>
-              <w:t>• Can change user roles &amp; delete accounts</w:t>
+              <w:t>• Can update roles &amp; delete accounts</w:t>
             </w:r>
           </w:p>
         </w:tc>
@@ -521,7 +466,6 @@
             <w:r>
               <w:rPr>
                 <w:rFonts w:ascii="Arial" w:hAnsi="Arial"/>
-                <w:sz w:val="20"/>
               </w:rPr>
               <w:t>Staff Member</w:t>
             </w:r>
@@ -536,7 +480,6 @@
               <w:rPr>
                 <w:rFonts w:ascii="Arial" w:hAnsi="Arial"/>
                 <w:b/>
-                <w:sz w:val="20"/>
               </w:rPr>
               <w:t>staff@tasktrack.com</w:t>
             </w:r>
@@ -551,7 +494,6 @@
               <w:rPr>
                 <w:rFonts w:ascii="Arial" w:hAnsi="Arial"/>
                 <w:b/>
-                <w:sz w:val="20"/>
               </w:rPr>
               <w:t>Staff@123456</w:t>
             </w:r>
@@ -565,7 +507,6 @@
             <w:r>
               <w:rPr>
                 <w:rFonts w:ascii="Arial" w:hAnsi="Arial"/>
-                <w:sz w:val="20"/>
               </w:rPr>
               <w:t>Role = 0 (Staff)</w:t>
               <w:br/>
@@ -587,7 +528,7 @@
           <w:rFonts w:ascii="Arial" w:hAnsi="Arial"/>
           <w:color w:val="1E3A8A"/>
         </w:rPr>
-        <w:t>3. Technical Implementation &amp; Bonus Features</w:t>
+        <w:t>4. Project Structure &amp; Technical Implementation</w:t>
       </w:r>
     </w:p>
     <w:p>
@@ -595,16 +536,32 @@
         <w:rPr>
           <w:rFonts w:ascii="Arial" w:hAnsi="Arial"/>
           <w:b/>
-          <w:sz w:val="21"/>
         </w:rPr>
-        <w:t xml:space="preserve">• Known Issues / Incomplete Features: </w:t>
+        <w:t>Backend Solution (.NET 8):</w:t>
       </w:r>
+    </w:p>
+    <w:p>
       <w:r>
         <w:rPr>
           <w:rFonts w:ascii="Arial" w:hAnsi="Arial"/>
-          <w:sz w:val="20"/>
         </w:rPr>
-        <w:t>None. All core requirements and 100% of bonus features are fully completed and tested.</w:t>
+        <w:t>• TaskTrack.API: AuthController (register, login, refresh-token, profile, change-password), AccountsController (Admin role 1 only), Protected Controllers (Departments, Projects, Tasks, Tags) decorated with [Authorize], Program.cs with JWT Bearer authentication scheme and Swagger Bearer Token support.</w:t>
+      </w:r>
+    </w:p>
+    <w:p>
+      <w:r>
+        <w:rPr>
+          <w:rFonts w:ascii="Arial" w:hAnsi="Arial"/>
+        </w:rPr>
+        <w:t>• TaskTrack.Repo: SystemAccount model, TaskManagementDbContext with audit relations, AccountRepository implementing user search, verification, refresh token tracking, and task dependency checks.</w:t>
+      </w:r>
+    </w:p>
+    <w:p>
+      <w:r>
+        <w:rPr>
+          <w:rFonts w:ascii="Arial" w:hAnsi="Arial"/>
+        </w:rPr>
+        <w:t>• TaskTrack.Service: AccountService with BCrypt.Net-Next hashing (WorkFactor 11), JWT token issuing with HMAC-SHA256, Refresh Token rotation (7-day lifetime), Audit logging for CreatedByID/UpdatedByID on Projects and Tasks.</w:t>
       </w:r>
     </w:p>
     <w:p>
@@ -612,101 +569,61 @@
         <w:rPr>
           <w:rFonts w:ascii="Arial" w:hAnsi="Arial"/>
           <w:b/>
-          <w:sz w:val="21"/>
         </w:rPr>
-        <w:t xml:space="preserve">• Authentication &amp; BCrypt Hashing: </w:t>
-      </w:r>
-      <w:r>
-        <w:rPr>
-          <w:rFonts w:ascii="Arial" w:hAnsi="Arial"/>
-          <w:sz w:val="20"/>
-        </w:rPr>
-        <w:t>Never stores plaintext passwords. Passwords are salted and hashed using BCrypt.Net-Next (WorkFactor 11). Unique email constraint is enforced with HTTP 409 Conflict response on registration.</w:t>
+        <w:t>Frontend Application (Next.js App Router):</w:t>
       </w:r>
     </w:p>
     <w:p>
       <w:r>
         <w:rPr>
           <w:rFonts w:ascii="Arial" w:hAnsi="Arial"/>
-          <w:b/>
-          <w:sz w:val="21"/>
         </w:rPr>
-        <w:t xml:space="preserve">• JWT Authorization &amp; RBAC: </w:t>
-      </w:r>
-      <w:r>
-        <w:rPr>
-          <w:rFonts w:ascii="Arial" w:hAnsi="Arial"/>
-          <w:sz w:val="20"/>
-        </w:rPr>
-        <w:t>Access tokens signed with HMAC-SHA256 containing AccountID, Email, Name, and Role claims. Write endpoints are decorated with [Authorize]. Admin endpoints (/api/accounts) are guarded with [Authorize(Roles = 1,Admin)]. Staff tokens receive HTTP 403 Forbidden.</w:t>
+        <w:t>• Public Pages: Overview (/), Departments (/departments), Projects (/projects/[id]), Tasks (/tasks/[id]), Multi-criteria Filter (/search).</w:t>
       </w:r>
     </w:p>
     <w:p>
       <w:r>
         <w:rPr>
           <w:rFonts w:ascii="Arial" w:hAnsi="Arial"/>
-          <w:b/>
-          <w:sz w:val="21"/>
         </w:rPr>
-        <w:t xml:space="preserve">• Bonus 1 - Refresh Token Mechanism: </w:t>
-      </w:r>
-      <w:r>
-        <w:rPr>
-          <w:rFonts w:ascii="Arial" w:hAnsi="Arial"/>
-          <w:sz w:val="20"/>
-        </w:rPr>
-        <w:t>Implements 7-day cryptographic refresh token rotation via POST /api/auth/refresh-token. The Next.js client automatically detects HTTP 401 and performs silent refresh without session interruption.</w:t>
+        <w:t>• Authentication Pages: Register (/register with client-side validation), Login (/login with auto-redirect to /admin), Profile (/profile for updating name &amp; changing password).</w:t>
       </w:r>
     </w:p>
     <w:p>
       <w:r>
         <w:rPr>
           <w:rFonts w:ascii="Arial" w:hAnsi="Arial"/>
-          <w:b/>
-          <w:sz w:val="21"/>
         </w:rPr>
-        <w:t xml:space="preserve">• Bonus 2 - User Profile Page (/profile): </w:t>
-      </w:r>
-      <w:r>
-        <w:rPr>
-          <w:rFonts w:ascii="Arial" w:hAnsi="Arial"/>
-          <w:sz w:val="20"/>
-        </w:rPr>
-        <w:t>Allows logged-in users to update their Full Name and securely change their password (verified against current password).</w:t>
+        <w:t>• Protected Admin Area: Dashboard (/admin with live stats cards), Management pages moved to /admin/departments, /admin/projects, /admin/tasks, /admin/tags, and Admin-exclusive /admin/accounts.</w:t>
       </w:r>
     </w:p>
     <w:p>
       <w:r>
         <w:rPr>
           <w:rFonts w:ascii="Arial" w:hAnsi="Arial"/>
-          <w:b/>
-          <w:sz w:val="21"/>
         </w:rPr>
-        <w:t xml:space="preserve">• Bonus 3 - Audit Trail (CreatedByID &amp; UpdatedByID): </w:t>
+        <w:t>• Session &amp; Architecture: AuthContext for global login state, automated Bearer token injection, silent 401 refresh token handler, and full responsive design.</w:t>
       </w:r>
+    </w:p>
+    <w:p/>
+    <w:p>
+      <w:pPr>
+        <w:pStyle w:val="Heading1"/>
+      </w:pPr>
       <w:r>
         <w:rPr>
           <w:rFonts w:ascii="Arial" w:hAnsi="Arial"/>
-          <w:sz w:val="20"/>
+          <w:color w:val="1E3A8A"/>
         </w:rPr>
-        <w:t>Projects and Tasks schema augmented with foreign keys pointing to SystemAccount. Automatically captures the identity of the authenticated user who initiated creations or edits.</w:t>
+        <w:t>5. Known Issues or Incomplete Features</w:t>
       </w:r>
     </w:p>
     <w:p>
       <w:r>
         <w:rPr>
           <w:rFonts w:ascii="Arial" w:hAnsi="Arial"/>
-          <w:b/>
-          <w:sz w:val="21"/>
         </w:rPr>
-        <w:t xml:space="preserve">• Bonus 4 - CI Pipeline &amp; Automated Testing: </w:t>
-      </w:r>
-      <w:r>
-        <w:rPr>
-          <w:rFonts w:ascii="Arial" w:hAnsi="Arial"/>
-          <w:sz w:val="20"/>
-        </w:rPr>
-        <w:t>GitHub Actions workflow runs .NET 8 build, Next.js build &amp; lint, and executes a full xUnit automated test suite (11/11 tests passed).</w:t>
+        <w:t>• None. All required endpoints, authentication &amp; authorization rules, protected management pages, and 100% of bonus features (Refresh Token mechanism, Profile management page, Audit fields CreatedByID/UpdatedByID, GitHub Actions CI build &amp; test pipeline) are fully implemented and verified.</w:t>
       </w:r>
     </w:p>
     <w:sectPr>

</xml_diff>